<commit_message>
Fix player state phases, AI director next-room logic, and tune ranged enemy speed/retreat
</commit_message>
<xml_diff>
--- a/Parameter Discussions/Logic_UI_Ques_Checklist.docx
+++ b/Parameter Discussions/Logic_UI_Ques_Checklist.docx
@@ -342,7 +342,7 @@
       <w:r>
         <w:lastRenderedPageBreak/>
         <w:pict w14:anchorId="60D0796A">
-          <v:rect id="_x0000_i1097" style="width:0;height:1.5pt" o:hralign="center" o:hrstd="t" o:hr="t" fillcolor="#a0a0a0" stroked="f"/>
+          <v:rect id="_x0000_i1025" style="width:0;height:1.5pt" o:hralign="center" o:hrstd="t" o:hr="t" fillcolor="#a0a0a0" stroked="f"/>
         </w:pict>
       </w:r>
     </w:p>
@@ -500,7 +500,7 @@
     <w:p>
       <w:r>
         <w:pict w14:anchorId="38CEC068">
-          <v:rect id="_x0000_i1098" style="width:0;height:1.5pt" o:hralign="center" o:hrstd="t" o:hr="t" fillcolor="#a0a0a0" stroked="f"/>
+          <v:rect id="_x0000_i1026" style="width:0;height:1.5pt" o:hralign="center" o:hrstd="t" o:hr="t" fillcolor="#a0a0a0" stroked="f"/>
         </w:pict>
       </w:r>
     </w:p>
@@ -752,7 +752,7 @@
     <w:p>
       <w:r>
         <w:pict w14:anchorId="6EB83B02">
-          <v:rect id="_x0000_i1099" style="width:0;height:1.5pt" o:hralign="center" o:hrstd="t" o:hr="t" fillcolor="#a0a0a0" stroked="f"/>
+          <v:rect id="_x0000_i1027" style="width:0;height:1.5pt" o:hralign="center" o:hrstd="t" o:hr="t" fillcolor="#a0a0a0" stroked="f"/>
         </w:pict>
       </w:r>
     </w:p>
@@ -931,7 +931,7 @@
     <w:p>
       <w:r>
         <w:pict w14:anchorId="2CBCA4C7">
-          <v:rect id="_x0000_i1100" style="width:0;height:1.5pt" o:hralign="center" o:hrstd="t" o:hr="t" fillcolor="#a0a0a0" stroked="f"/>
+          <v:rect id="_x0000_i1028" style="width:0;height:1.5pt" o:hralign="center" o:hrstd="t" o:hr="t" fillcolor="#a0a0a0" stroked="f"/>
         </w:pict>
       </w:r>
     </w:p>
@@ -1204,7 +1204,7 @@
     <w:p>
       <w:r>
         <w:pict w14:anchorId="5C0A333E">
-          <v:rect id="_x0000_i1101" style="width:0;height:1.5pt" o:hralign="center" o:hrstd="t" o:hr="t" fillcolor="#a0a0a0" stroked="f"/>
+          <v:rect id="_x0000_i1029" style="width:0;height:1.5pt" o:hralign="center" o:hrstd="t" o:hr="t" fillcolor="#a0a0a0" stroked="f"/>
         </w:pict>
       </w:r>
     </w:p>
@@ -1316,7 +1316,7 @@
       <w:r>
         <w:lastRenderedPageBreak/>
         <w:pict w14:anchorId="0E5CC045">
-          <v:rect id="_x0000_i1102" style="width:0;height:1.5pt" o:hralign="center" o:hrstd="t" o:hr="t" fillcolor="#a0a0a0" stroked="f"/>
+          <v:rect id="_x0000_i1030" style="width:0;height:1.5pt" o:hralign="center" o:hrstd="t" o:hr="t" fillcolor="#a0a0a0" stroked="f"/>
         </w:pict>
       </w:r>
     </w:p>
@@ -1545,7 +1545,7 @@
     <w:p>
       <w:r>
         <w:pict w14:anchorId="1748DC61">
-          <v:rect id="_x0000_i1103" style="width:0;height:1.5pt" o:hralign="center" o:hrstd="t" o:hr="t" fillcolor="#a0a0a0" stroked="f"/>
+          <v:rect id="_x0000_i1031" style="width:0;height:1.5pt" o:hralign="center" o:hrstd="t" o:hr="t" fillcolor="#a0a0a0" stroked="f"/>
         </w:pict>
       </w:r>
     </w:p>
@@ -1768,7 +1768,7 @@
     <w:p>
       <w:r>
         <w:pict w14:anchorId="613B2963">
-          <v:rect id="_x0000_i1104" style="width:0;height:1.5pt" o:hralign="center" o:hrstd="t" o:hr="t" fillcolor="#a0a0a0" stroked="f"/>
+          <v:rect id="_x0000_i1032" style="width:0;height:1.5pt" o:hralign="center" o:hrstd="t" o:hr="t" fillcolor="#a0a0a0" stroked="f"/>
         </w:pict>
       </w:r>
     </w:p>
@@ -1987,7 +1987,7 @@
     <w:p>
       <w:r>
         <w:pict w14:anchorId="35AFA4FD">
-          <v:rect id="_x0000_i1105" style="width:0;height:1.5pt" o:hralign="center" o:hrstd="t" o:hr="t" fillcolor="#a0a0a0" stroked="f"/>
+          <v:rect id="_x0000_i1033" style="width:0;height:1.5pt" o:hralign="center" o:hrstd="t" o:hr="t" fillcolor="#a0a0a0" stroked="f"/>
         </w:pict>
       </w:r>
     </w:p>
@@ -2135,7 +2135,7 @@
     <w:p>
       <w:r>
         <w:pict w14:anchorId="2E595893">
-          <v:rect id="_x0000_i1106" style="width:0;height:1.5pt" o:hralign="center" o:hrstd="t" o:hr="t" fillcolor="#a0a0a0" stroked="f"/>
+          <v:rect id="_x0000_i1034" style="width:0;height:1.5pt" o:hralign="center" o:hrstd="t" o:hr="t" fillcolor="#a0a0a0" stroked="f"/>
         </w:pict>
       </w:r>
     </w:p>
@@ -2346,7 +2346,7 @@
     <w:p>
       <w:r>
         <w:pict w14:anchorId="34A7D100">
-          <v:rect id="_x0000_i1107" style="width:0;height:1.5pt" o:hralign="center" o:hrstd="t" o:hr="t" fillcolor="#a0a0a0" stroked="f"/>
+          <v:rect id="_x0000_i1035" style="width:0;height:1.5pt" o:hralign="center" o:hrstd="t" o:hr="t" fillcolor="#a0a0a0" stroked="f"/>
         </w:pict>
       </w:r>
     </w:p>
@@ -2478,7 +2478,7 @@
     <w:p>
       <w:r>
         <w:pict w14:anchorId="2509BF6C">
-          <v:rect id="_x0000_i1108" style="width:0;height:1.5pt" o:hralign="center" o:hrstd="t" o:hr="t" fillcolor="#a0a0a0" stroked="f"/>
+          <v:rect id="_x0000_i1036" style="width:0;height:1.5pt" o:hralign="center" o:hrstd="t" o:hr="t" fillcolor="#a0a0a0" stroked="f"/>
         </w:pict>
       </w:r>
     </w:p>

</xml_diff>